<commit_message>
fix: remove redundant value arg from date_input to prevent initialization warning
</commit_message>
<xml_diff>
--- a/medical_gen/template_cloned.docx
+++ b/medical_gen/template_cloned.docx
@@ -15246,7 +15246,7 @@
         <w:ind w:right="-154"/>
         <w:jc w:val="center"/>
         <w:rPr>
-          <w:rFonts w:asciiTheme="minorBidi" w:hAnsiTheme="minorBidi" w:cstheme="minorBidi"/>
+          <w:rFonts w:asciiTheme="minorBidi" w:eastAsia="Noto Sans Devanagari" w:hAnsiTheme="minorBidi" w:cs="Mangal"/>
           <w:b/>
           <w:bCs/>
           <w:u w:val="single"/>
@@ -15308,232 +15308,370 @@
         <w:t>दाखला</w:t>
       </w:r>
     </w:p>
+    <w:tbl>
+      <w:tblPr>
+        <w:tblStyle w:val="TableGrid"/>
+        <w:tblW w:w="0" w:type="auto"/>
+        <w:tblInd w:w="108" w:type="dxa"/>
+        <w:tblBorders>
+          <w:top w:val="none" w:sz="0" w:space="0" w:color="auto"/>
+          <w:left w:val="none" w:sz="0" w:space="0" w:color="auto"/>
+          <w:bottom w:val="none" w:sz="0" w:space="0" w:color="auto"/>
+          <w:right w:val="none" w:sz="0" w:space="0" w:color="auto"/>
+          <w:insideH w:val="none" w:sz="0" w:space="0" w:color="auto"/>
+          <w:insideV w:val="none" w:sz="0" w:space="0" w:color="auto"/>
+        </w:tblBorders>
+        <w:tblLook w:val="04A0" w:firstRow="1" w:lastRow="0" w:firstColumn="1" w:lastColumn="0" w:noHBand="0" w:noVBand="1"/>
+      </w:tblPr>
+      <w:tblGrid>
+        <w:gridCol w:w="2610"/>
+        <w:gridCol w:w="6660"/>
+      </w:tblGrid>
+      <w:tr>
+        <w:trPr>
+          <w:trHeight w:val="530"/>
+        </w:trPr>
+        <w:tc>
+          <w:tcPr>
+            <w:tcW w:w="2610" w:type="dxa"/>
+          </w:tcPr>
+          <w:p>
+            <w:pPr>
+              <w:pStyle w:val="BodyText"/>
+              <w:tabs>
+                <w:tab w:val="left" w:pos="9369"/>
+              </w:tabs>
+              <w:spacing w:before="271"/>
+              <w:ind w:right="-154"/>
+              <w:rPr>
+                <w:rFonts w:asciiTheme="minorBidi" w:hAnsiTheme="minorBidi" w:cstheme="minorBidi"/>
+                <w:b/>
+                <w:bCs/>
+                <w:u w:val="single"/>
+                <w:lang w:bidi="hi-IN"/>
+              </w:rPr>
+            </w:pPr>
+            <w:r>
+              <w:rPr>
+                <w:rFonts w:ascii="Noto Sans Devanagari" w:eastAsia="Noto Sans Devanagari" w:hAnsi="Noto Sans Devanagari" w:cs="Mangal"/>
+                <w:sz w:val="24"/>
+                <w:szCs w:val="24"/>
+                <w:cs/>
+                <w:lang w:bidi="hi-IN"/>
+              </w:rPr>
+              <w:t>दवाखान्याचे</w:t>
+            </w:r>
+            <w:r>
+              <w:rPr>
+                <w:rFonts w:ascii="Arial" w:eastAsia="Arial" w:hAnsi="Arial" w:cs="Arial"/>
+                <w:sz w:val="24"/>
+                <w:szCs w:val="24"/>
+                <w:lang w:bidi="hi-IN"/>
+              </w:rPr>
+              <w:t xml:space="preserve"> </w:t>
+            </w:r>
+            <w:r>
+              <w:rPr>
+                <w:rFonts w:ascii="Noto Sans Devanagari" w:eastAsia="Noto Sans Devanagari" w:hAnsi="Noto Sans Devanagari" w:cs="Mangal"/>
+                <w:sz w:val="24"/>
+                <w:szCs w:val="24"/>
+                <w:cs/>
+                <w:lang w:bidi="hi-IN"/>
+              </w:rPr>
+              <w:t>नांव</w:t>
+            </w:r>
+          </w:p>
+        </w:tc>
+        <w:tc>
+          <w:tcPr>
+            <w:tcW w:w="6660" w:type="dxa"/>
+          </w:tcPr>
+          <w:p>
+            <w:pPr>
+              <w:pStyle w:val="BodyText"/>
+              <w:tabs>
+                <w:tab w:val="left" w:pos="9369"/>
+              </w:tabs>
+              <w:ind w:left="450" w:right="-154" w:hanging="360"/>
+              <w:jc w:val="center"/>
+              <w:rPr>
+                <w:rFonts w:ascii="Arial" w:eastAsia="Arial" w:hAnsi="Arial" w:cs="Arial"/>
+                <w:sz w:val="24"/>
+                <w:szCs w:val="24"/>
+                <w:lang w:bidi="hi-IN"/>
+              </w:rPr>
+            </w:pPr>
+          </w:p>
+          <w:p>
+            <w:pPr>
+              <w:pStyle w:val="BodyText"/>
+              <w:tabs>
+                <w:tab w:val="left" w:pos="9369"/>
+              </w:tabs>
+              <w:ind w:right="-154"/>
+              <w:rPr>
+                <w:rFonts w:ascii="Mangal" w:hAnsi="Mangal" w:cs="Mangal"/>
+              </w:rPr>
+            </w:pPr>
+            <w:r>
+              <w:rPr>
+                <w:rFonts w:ascii="Arial" w:eastAsia="Arial" w:hAnsi="Arial" w:cs="Arial"/>
+                <w:sz w:val="24"/>
+                <w:szCs w:val="24"/>
+                <w:lang w:bidi="hi-IN"/>
+              </w:rPr>
+              <w:t xml:space="preserve">:    </w:t>
+            </w:r>
+            <w:r>
+              <w:rPr>
+                <w:rFonts w:ascii="Arial" w:eastAsia="Arial" w:hAnsi="Arial" w:cs="Arial"/>
+                <w:b/>
+                <w:bCs/>
+                <w:sz w:val="22"/>
+                <w:szCs w:val="22"/>
+                <w:lang w:bidi="hi-IN"/>
+              </w:rPr>
+              <w:t>{{hospital_name</w:t>
+            </w:r>
+            <w:r>
+              <w:rPr>
+                <w:rFonts w:ascii="Arial" w:eastAsia="Arial" w:hAnsi="Arial" w:cs="Arial"/>
+                <w:b/>
+                <w:bCs/>
+                <w:sz w:val="22"/>
+                <w:szCs w:val="22"/>
+                <w:lang w:eastAsia="en-IN"/>
+              </w:rPr>
+              <w:t>_marathi}}</w:t>
+            </w:r>
+          </w:p>
+        </w:tc>
+      </w:tr>
+      <w:tr>
+        <w:tc>
+          <w:tcPr>
+            <w:tcW w:w="2610" w:type="dxa"/>
+          </w:tcPr>
+          <w:p>
+            <w:pPr>
+              <w:pStyle w:val="BodyText"/>
+              <w:tabs>
+                <w:tab w:val="left" w:pos="9369"/>
+              </w:tabs>
+              <w:spacing w:before="271"/>
+              <w:ind w:right="-154"/>
+              <w:rPr>
+                <w:rFonts w:asciiTheme="minorBidi" w:hAnsiTheme="minorBidi" w:cstheme="minorBidi"/>
+                <w:b/>
+                <w:bCs/>
+                <w:u w:val="single"/>
+                <w:lang w:bidi="hi-IN"/>
+              </w:rPr>
+            </w:pPr>
+            <w:r>
+              <w:rPr>
+                <w:rFonts w:ascii="Noto Sans Devanagari" w:eastAsia="Noto Sans Devanagari" w:hAnsi="Noto Sans Devanagari" w:cs="Mangal"/>
+                <w:sz w:val="22"/>
+                <w:szCs w:val="22"/>
+                <w:cs/>
+                <w:lang w:bidi="hi-IN"/>
+              </w:rPr>
+              <w:t>आजाराचा</w:t>
+            </w:r>
+            <w:r>
+              <w:rPr>
+                <w:rFonts w:ascii="Arial" w:eastAsia="Arial" w:hAnsi="Arial" w:cs="Arial"/>
+                <w:sz w:val="22"/>
+                <w:szCs w:val="22"/>
+                <w:lang w:bidi="hi-IN"/>
+              </w:rPr>
+              <w:t xml:space="preserve"> </w:t>
+            </w:r>
+            <w:r>
+              <w:rPr>
+                <w:rFonts w:ascii="Noto Sans Devanagari" w:eastAsia="Noto Sans Devanagari" w:hAnsi="Noto Sans Devanagari" w:cs="Mangal"/>
+                <w:sz w:val="22"/>
+                <w:szCs w:val="22"/>
+                <w:cs/>
+                <w:lang w:bidi="hi-IN"/>
+              </w:rPr>
+              <w:t>कालावधी</w:t>
+            </w:r>
+          </w:p>
+        </w:tc>
+        <w:tc>
+          <w:tcPr>
+            <w:tcW w:w="6660" w:type="dxa"/>
+          </w:tcPr>
+          <w:p>
+            <w:pPr>
+              <w:pStyle w:val="BodyText"/>
+              <w:tabs>
+                <w:tab w:val="left" w:pos="9369"/>
+              </w:tabs>
+              <w:ind w:right="-154"/>
+              <w:rPr>
+                <w:rFonts w:ascii="Arial" w:eastAsia="Arial" w:hAnsi="Arial" w:cs="Arial"/>
+                <w:sz w:val="22"/>
+                <w:szCs w:val="22"/>
+                <w:lang w:bidi="hi-IN"/>
+              </w:rPr>
+            </w:pPr>
+          </w:p>
+          <w:p>
+            <w:pPr>
+              <w:pStyle w:val="BodyText"/>
+              <w:tabs>
+                <w:tab w:val="left" w:pos="9369"/>
+              </w:tabs>
+              <w:ind w:right="-154"/>
+              <w:rPr>
+                <w:sz w:val="22"/>
+                <w:szCs w:val="22"/>
+              </w:rPr>
+            </w:pPr>
+            <w:r>
+              <w:rPr>
+                <w:rFonts w:ascii="Arial" w:eastAsia="Arial" w:hAnsi="Arial" w:cs="Arial"/>
+                <w:sz w:val="22"/>
+                <w:szCs w:val="22"/>
+                <w:lang w:bidi="hi-IN"/>
+              </w:rPr>
+              <w:t xml:space="preserve">:     </w:t>
+            </w:r>
+            <w:r>
+              <w:rPr>
+                <w:rFonts w:ascii="Arial" w:eastAsia="Arial" w:hAnsi="Arial" w:cs="Arial"/>
+                <w:b/>
+                <w:bCs/>
+                <w:sz w:val="22"/>
+                <w:szCs w:val="22"/>
+                <w:lang w:eastAsia="en-IN"/>
+              </w:rPr>
+              <w:t>{{admit_date_from}}  to {{admit_date_to}}</w:t>
+            </w:r>
+          </w:p>
+        </w:tc>
+      </w:tr>
+      <w:tr>
+        <w:tc>
+          <w:tcPr>
+            <w:tcW w:w="2610" w:type="dxa"/>
+          </w:tcPr>
+          <w:p>
+            <w:pPr>
+              <w:pStyle w:val="BodyText"/>
+              <w:tabs>
+                <w:tab w:val="left" w:pos="9369"/>
+              </w:tabs>
+              <w:spacing w:before="271"/>
+              <w:ind w:right="-154"/>
+              <w:rPr>
+                <w:rFonts w:asciiTheme="minorBidi" w:hAnsiTheme="minorBidi" w:cstheme="minorBidi"/>
+                <w:b/>
+                <w:bCs/>
+                <w:u w:val="single"/>
+                <w:lang w:bidi="hi-IN"/>
+              </w:rPr>
+            </w:pPr>
+            <w:r>
+              <w:rPr>
+                <w:rFonts w:ascii="Noto Sans Devanagari" w:eastAsia="Noto Sans Devanagari" w:hAnsi="Noto Sans Devanagari" w:cs="Mangal"/>
+                <w:sz w:val="22"/>
+                <w:szCs w:val="22"/>
+                <w:cs/>
+                <w:lang w:bidi="hi-IN"/>
+              </w:rPr>
+              <w:t>रुग्णाचे</w:t>
+            </w:r>
+            <w:r>
+              <w:rPr>
+                <w:rFonts w:ascii="Arial" w:eastAsia="Arial" w:hAnsi="Arial" w:cs="Arial"/>
+                <w:sz w:val="22"/>
+                <w:szCs w:val="22"/>
+                <w:lang w:bidi="hi-IN"/>
+              </w:rPr>
+              <w:t xml:space="preserve"> </w:t>
+            </w:r>
+            <w:r>
+              <w:rPr>
+                <w:rFonts w:ascii="Noto Sans Devanagari" w:eastAsia="Noto Sans Devanagari" w:hAnsi="Noto Sans Devanagari" w:cs="Mangal"/>
+                <w:sz w:val="22"/>
+                <w:szCs w:val="22"/>
+                <w:cs/>
+                <w:lang w:bidi="hi-IN"/>
+              </w:rPr>
+              <w:t>नांव</w:t>
+            </w:r>
+          </w:p>
+        </w:tc>
+        <w:tc>
+          <w:tcPr>
+            <w:tcW w:w="6660" w:type="dxa"/>
+          </w:tcPr>
+          <w:p>
+            <w:pPr>
+              <w:pStyle w:val="BodyText"/>
+              <w:tabs>
+                <w:tab w:val="left" w:pos="9369"/>
+              </w:tabs>
+              <w:spacing w:before="271"/>
+              <w:ind w:right="-154"/>
+              <w:rPr>
+                <w:rFonts w:asciiTheme="minorBidi" w:hAnsiTheme="minorBidi" w:cstheme="minorBidi"/>
+                <w:b/>
+                <w:bCs/>
+                <w:u w:val="single"/>
+                <w:lang w:bidi="hi-IN"/>
+              </w:rPr>
+            </w:pPr>
+            <w:r>
+              <w:rPr>
+                <w:rFonts w:ascii="Arial" w:eastAsia="Arial" w:hAnsi="Arial" w:cs="Arial"/>
+                <w:sz w:val="22"/>
+                <w:szCs w:val="22"/>
+                <w:lang w:bidi="hi-IN"/>
+              </w:rPr>
+              <w:t xml:space="preserve">:     </w:t>
+            </w:r>
+            <w:r>
+              <w:rPr>
+                <w:rFonts w:ascii="Arial" w:eastAsia="Arial" w:hAnsi="Arial" w:cs="Arial"/>
+                <w:b/>
+                <w:bCs/>
+                <w:sz w:val="22"/>
+                <w:szCs w:val="22"/>
+                <w:lang w:bidi="hi-IN"/>
+              </w:rPr>
+              <w:t>{{patient_name</w:t>
+            </w:r>
+            <w:r>
+              <w:rPr>
+                <w:rFonts w:ascii="Arial" w:eastAsia="Arial" w:hAnsi="Arial" w:cs="Arial"/>
+                <w:b/>
+                <w:bCs/>
+                <w:sz w:val="22"/>
+                <w:szCs w:val="22"/>
+                <w:lang w:eastAsia="en-IN"/>
+              </w:rPr>
+              <w:t>_marathi}}</w:t>
+            </w:r>
+          </w:p>
+        </w:tc>
+      </w:tr>
+    </w:tbl>
     <w:p>
       <w:pPr>
         <w:pStyle w:val="BodyText"/>
         <w:tabs>
           <w:tab w:val="left" w:pos="9369"/>
         </w:tabs>
-        <w:spacing w:before="271"/>
-        <w:ind w:left="450" w:right="-154" w:hanging="360"/>
-        <w:jc w:val="center"/>
-        <w:rPr>
-          <w:rFonts w:asciiTheme="minorBidi" w:hAnsiTheme="minorBidi" w:cstheme="minorBidi"/>
-          <w:b/>
-          <w:bCs/>
-          <w:sz w:val="2"/>
-          <w:szCs w:val="2"/>
-          <w:u w:val="single"/>
-          <w:lang w:bidi="hi-IN"/>
+        <w:ind w:right="-154"/>
+        <w:rPr>
+          <w:sz w:val="22"/>
+          <w:szCs w:val="22"/>
         </w:rPr>
       </w:pPr>
-    </w:p>
-    <w:p>
-      <w:pPr>
-        <w:pStyle w:val="BodyText"/>
-        <w:tabs>
-          <w:tab w:val="left" w:pos="9369"/>
-        </w:tabs>
-        <w:ind w:left="450" w:right="-154" w:hanging="360"/>
-        <w:rPr>
-          <w:rFonts w:ascii="Mangal" w:hAnsi="Mangal" w:cs="Mangal"/>
-        </w:rPr>
-      </w:pPr>
-      <w:r>
-        <w:rPr>
-          <w:rFonts w:ascii="Noto Sans Devanagari" w:eastAsia="Noto Sans Devanagari" w:hAnsi="Noto Sans Devanagari" w:cs="Mangal"/>
-          <w:sz w:val="24"/>
-          <w:szCs w:val="24"/>
-          <w:cs/>
-          <w:lang w:bidi="hi-IN"/>
-        </w:rPr>
-        <w:t>दवाखान्याचे</w:t>
-      </w:r>
-      <w:r>
-        <w:rPr>
-          <w:rFonts w:ascii="Arial" w:eastAsia="Arial" w:hAnsi="Arial" w:cs="Arial"/>
-          <w:sz w:val="24"/>
-          <w:szCs w:val="24"/>
-          <w:lang w:bidi="hi-IN"/>
-        </w:rPr>
-        <w:t xml:space="preserve"> </w:t>
-      </w:r>
-      <w:r>
-        <w:rPr>
-          <w:rFonts w:ascii="Noto Sans Devanagari" w:eastAsia="Noto Sans Devanagari" w:hAnsi="Noto Sans Devanagari" w:cs="Mangal"/>
-          <w:sz w:val="24"/>
-          <w:szCs w:val="24"/>
-          <w:cs/>
-          <w:lang w:bidi="hi-IN"/>
-        </w:rPr>
-        <w:t>नांव</w:t>
-      </w:r>
-      <w:r>
-        <w:rPr>
-          <w:rFonts w:ascii="Arial" w:eastAsia="Arial" w:hAnsi="Arial" w:cs="Arial"/>
-          <w:sz w:val="24"/>
-          <w:szCs w:val="24"/>
-          <w:lang w:bidi="hi-IN"/>
-        </w:rPr>
-        <w:t xml:space="preserve">    :    </w:t>
-      </w:r>
-      <w:r>
-        <w:rPr>
-          <w:rFonts w:ascii="Arial" w:eastAsia="Arial" w:hAnsi="Arial" w:cs="Arial"/>
-          <w:b/>
-          <w:bCs/>
-          <w:sz w:val="22"/>
-          <w:szCs w:val="22"/>
-          <w:lang w:bidi="hi-IN"/>
-        </w:rPr>
-        <w:t>{{hospital_name</w:t>
-      </w:r>
-      <w:r>
-        <w:rPr>
-          <w:rFonts w:ascii="Arial" w:eastAsia="Arial" w:hAnsi="Arial" w:cs="Arial"/>
-          <w:b/>
-          <w:bCs/>
-          <w:sz w:val="22"/>
-          <w:szCs w:val="22"/>
-          <w:lang w:eastAsia="en-IN"/>
-        </w:rPr>
-        <w:t>_marathi}}</w:t>
-      </w:r>
-    </w:p>
-    <w:p>
-      <w:pPr>
-        <w:pStyle w:val="BodyText"/>
-        <w:tabs>
-          <w:tab w:val="left" w:pos="9369"/>
-        </w:tabs>
-        <w:ind w:left="450" w:right="-154" w:hanging="360"/>
-        <w:rPr>
-          <w:sz w:val="22"/>
-          <w:szCs w:val="22"/>
-        </w:rPr>
-      </w:pPr>
-      <w:r>
-        <w:rPr>
-          <w:rFonts w:ascii="Noto Sans Devanagari" w:eastAsia="Noto Sans Devanagari" w:hAnsi="Noto Sans Devanagari" w:cs="Mangal"/>
-          <w:sz w:val="22"/>
-          <w:szCs w:val="22"/>
-          <w:cs/>
-          <w:lang w:bidi="hi-IN"/>
-        </w:rPr>
-        <w:t>आजाराचा</w:t>
-      </w:r>
-      <w:r>
-        <w:rPr>
-          <w:rFonts w:ascii="Arial" w:eastAsia="Arial" w:hAnsi="Arial" w:cs="Arial"/>
-          <w:sz w:val="22"/>
-          <w:szCs w:val="22"/>
-          <w:lang w:bidi="hi-IN"/>
-        </w:rPr>
-        <w:t xml:space="preserve"> </w:t>
-      </w:r>
-      <w:r>
-        <w:rPr>
-          <w:rFonts w:ascii="Noto Sans Devanagari" w:eastAsia="Noto Sans Devanagari" w:hAnsi="Noto Sans Devanagari" w:cs="Mangal"/>
-          <w:sz w:val="22"/>
-          <w:szCs w:val="22"/>
-          <w:cs/>
-          <w:lang w:bidi="hi-IN"/>
-        </w:rPr>
-        <w:t>कालावधी</w:t>
-      </w:r>
-      <w:r>
-        <w:rPr>
-          <w:rFonts w:ascii="Arial" w:eastAsia="Arial" w:hAnsi="Arial" w:cs="Arial"/>
-          <w:sz w:val="22"/>
-          <w:szCs w:val="22"/>
-          <w:lang w:bidi="hi-IN"/>
-        </w:rPr>
-        <w:t xml:space="preserve">  :     </w:t>
-      </w:r>
-      <w:r>
-        <w:rPr>
-          <w:rFonts w:ascii="Arial" w:eastAsia="Arial" w:hAnsi="Arial" w:cs="Arial"/>
-          <w:b/>
-          <w:bCs/>
-          <w:sz w:val="22"/>
-          <w:szCs w:val="22"/>
-          <w:lang w:eastAsia="en-IN"/>
-        </w:rPr>
-        <w:t>{{admit_date_from}}  to {{admit_date_to}}</w:t>
-      </w:r>
-    </w:p>
-    <w:p>
-      <w:pPr>
-        <w:pStyle w:val="BodyText"/>
-        <w:tabs>
-          <w:tab w:val="left" w:pos="9369"/>
-        </w:tabs>
-        <w:ind w:left="450" w:right="-154" w:hanging="360"/>
-        <w:rPr>
-          <w:sz w:val="22"/>
-          <w:szCs w:val="22"/>
-        </w:rPr>
-      </w:pPr>
-      <w:r>
-        <w:rPr>
-          <w:rFonts w:ascii="Noto Sans Devanagari" w:eastAsia="Noto Sans Devanagari" w:hAnsi="Noto Sans Devanagari" w:cs="Mangal"/>
-          <w:sz w:val="22"/>
-          <w:szCs w:val="22"/>
-          <w:cs/>
-          <w:lang w:bidi="hi-IN"/>
-        </w:rPr>
-        <w:t>रुग्णाचे</w:t>
-      </w:r>
-      <w:r>
-        <w:rPr>
-          <w:rFonts w:ascii="Arial" w:eastAsia="Arial" w:hAnsi="Arial" w:cs="Arial"/>
-          <w:sz w:val="22"/>
-          <w:szCs w:val="22"/>
-          <w:lang w:bidi="hi-IN"/>
-        </w:rPr>
-        <w:t xml:space="preserve"> </w:t>
-      </w:r>
-      <w:r>
-        <w:rPr>
-          <w:rFonts w:ascii="Noto Sans Devanagari" w:eastAsia="Noto Sans Devanagari" w:hAnsi="Noto Sans Devanagari" w:cs="Mangal"/>
-          <w:sz w:val="22"/>
-          <w:szCs w:val="22"/>
-          <w:cs/>
-          <w:lang w:bidi="hi-IN"/>
-        </w:rPr>
-        <w:t>नांव</w:t>
-      </w:r>
-      <w:r>
-        <w:rPr>
-          <w:rFonts w:ascii="Arial" w:eastAsia="Arial" w:hAnsi="Arial" w:cs="Arial"/>
-          <w:sz w:val="22"/>
-          <w:szCs w:val="22"/>
-          <w:lang w:bidi="hi-IN"/>
-        </w:rPr>
-        <w:t xml:space="preserve">        :     </w:t>
-      </w:r>
-      <w:r>
-        <w:rPr>
-          <w:rFonts w:ascii="Arial" w:eastAsia="Arial" w:hAnsi="Arial" w:cs="Arial"/>
-          <w:b/>
-          <w:bCs/>
-          <w:sz w:val="22"/>
-          <w:szCs w:val="22"/>
-          <w:lang w:bidi="hi-IN"/>
-        </w:rPr>
-        <w:t>{{patient_name</w:t>
-      </w:r>
-      <w:r>
-        <w:rPr>
-          <w:rFonts w:ascii="Arial" w:eastAsia="Arial" w:hAnsi="Arial" w:cs="Arial"/>
-          <w:b/>
-          <w:bCs/>
-          <w:sz w:val="22"/>
-          <w:szCs w:val="22"/>
-          <w:lang w:eastAsia="en-IN"/>
-        </w:rPr>
-        <w:t>_marathi}}</w:t>
-      </w:r>
     </w:p>
     <w:tbl>
       <w:tblPr>
@@ -16900,7 +17038,6 @@
               </w:tabs>
               <w:spacing w:before="271"/>
               <w:ind w:right="-154"/>
-              <w:jc w:val="center"/>
               <w:rPr>
                 <w:rFonts w:asciiTheme="minorBidi" w:hAnsiTheme="minorBidi" w:cstheme="minorBidi"/>
                 <w:b/>
@@ -17183,7 +17320,6 @@
               </w:tabs>
               <w:spacing w:before="271" w:line="173" w:lineRule="atLeast"/>
               <w:ind w:left="90" w:right="-154"/>
-              <w:jc w:val="center"/>
               <w:rPr>
                 <w:rFonts w:asciiTheme="minorBidi" w:hAnsiTheme="minorBidi" w:cstheme="minorBidi"/>
                 <w:b/>
@@ -17670,7 +17806,6 @@
               </w:tabs>
               <w:spacing w:before="271"/>
               <w:ind w:left="450" w:right="-154" w:hanging="360"/>
-              <w:jc w:val="center"/>
               <w:rPr>
                 <w:rFonts w:asciiTheme="minorBidi" w:hAnsiTheme="minorBidi" w:cstheme="minorBidi"/>
                 <w:b/>
@@ -17687,6 +17822,86 @@
         <w:tc>
           <w:tcPr>
             <w:tcW w:w="1167" w:type="dxa"/>
+          </w:tcPr>
+          <w:p>
+            <w:pPr>
+              <w:pStyle w:val="BodyText"/>
+              <w:tabs>
+                <w:tab w:val="left" w:pos="9369"/>
+              </w:tabs>
+              <w:spacing w:before="271"/>
+              <w:ind w:left="450" w:right="-154" w:hanging="360"/>
+              <w:rPr>
+                <w:rFonts w:asciiTheme="minorBidi" w:hAnsiTheme="minorBidi" w:cstheme="minorBidi"/>
+                <w:b/>
+                <w:bCs/>
+                <w:w w:val="90"/>
+                <w:sz w:val="20"/>
+                <w:szCs w:val="20"/>
+                <w:u w:val="single"/>
+                <w:lang w:val="en-US"/>
+              </w:rPr>
+            </w:pPr>
+          </w:p>
+        </w:tc>
+        <w:tc>
+          <w:tcPr>
+            <w:tcW w:w="1263" w:type="dxa"/>
+          </w:tcPr>
+          <w:p>
+            <w:pPr>
+              <w:pStyle w:val="BodyText"/>
+              <w:tabs>
+                <w:tab w:val="left" w:pos="9369"/>
+              </w:tabs>
+              <w:spacing w:before="271"/>
+              <w:ind w:left="450" w:right="342" w:hanging="360"/>
+              <w:rPr>
+                <w:rFonts w:asciiTheme="minorBidi" w:hAnsiTheme="minorBidi" w:cstheme="minorBidi"/>
+                <w:b/>
+                <w:bCs/>
+                <w:w w:val="90"/>
+                <w:sz w:val="20"/>
+                <w:szCs w:val="20"/>
+                <w:u w:val="single"/>
+                <w:lang w:val="en-US"/>
+              </w:rPr>
+            </w:pPr>
+          </w:p>
+        </w:tc>
+        <w:tc>
+          <w:tcPr>
+            <w:tcW w:w="1532" w:type="dxa"/>
+          </w:tcPr>
+          <w:p>
+            <w:pPr>
+              <w:pStyle w:val="BodyText"/>
+              <w:tabs>
+                <w:tab w:val="left" w:pos="9369"/>
+              </w:tabs>
+              <w:spacing w:before="271"/>
+              <w:ind w:left="450" w:right="-154" w:hanging="360"/>
+              <w:rPr>
+                <w:rFonts w:asciiTheme="minorBidi" w:hAnsiTheme="minorBidi" w:cstheme="minorBidi"/>
+                <w:b/>
+                <w:bCs/>
+                <w:w w:val="90"/>
+                <w:sz w:val="20"/>
+                <w:szCs w:val="20"/>
+                <w:u w:val="single"/>
+                <w:lang w:val="en-US"/>
+              </w:rPr>
+            </w:pPr>
+          </w:p>
+        </w:tc>
+      </w:tr>
+      <w:tr>
+        <w:trPr>
+          <w:trHeight w:val="692"/>
+        </w:trPr>
+        <w:tc>
+          <w:tcPr>
+            <w:tcW w:w="715" w:type="dxa"/>
           </w:tcPr>
           <w:p>
             <w:pPr>
@@ -17702,8 +17917,8 @@
                 <w:b/>
                 <w:bCs/>
                 <w:w w:val="90"/>
-                <w:sz w:val="20"/>
-                <w:szCs w:val="20"/>
+                <w:sz w:val="22"/>
+                <w:szCs w:val="22"/>
                 <w:u w:val="single"/>
                 <w:lang w:val="en-US"/>
               </w:rPr>
@@ -17712,33 +17927,7 @@
         </w:tc>
         <w:tc>
           <w:tcPr>
-            <w:tcW w:w="1263" w:type="dxa"/>
-          </w:tcPr>
-          <w:p>
-            <w:pPr>
-              <w:pStyle w:val="BodyText"/>
-              <w:tabs>
-                <w:tab w:val="left" w:pos="9369"/>
-              </w:tabs>
-              <w:spacing w:before="271"/>
-              <w:ind w:left="450" w:right="342" w:hanging="360"/>
-              <w:jc w:val="center"/>
-              <w:rPr>
-                <w:rFonts w:asciiTheme="minorBidi" w:hAnsiTheme="minorBidi" w:cstheme="minorBidi"/>
-                <w:b/>
-                <w:bCs/>
-                <w:w w:val="90"/>
-                <w:sz w:val="20"/>
-                <w:szCs w:val="20"/>
-                <w:u w:val="single"/>
-                <w:lang w:val="en-US"/>
-              </w:rPr>
-            </w:pPr>
-          </w:p>
-        </w:tc>
-        <w:tc>
-          <w:tcPr>
-            <w:tcW w:w="1532" w:type="dxa"/>
+            <w:tcW w:w="3425" w:type="dxa"/>
           </w:tcPr>
           <w:p>
             <w:pPr>
@@ -17748,28 +17937,22 @@
               </w:tabs>
               <w:spacing w:before="271"/>
               <w:ind w:left="450" w:right="-154" w:hanging="360"/>
-              <w:jc w:val="center"/>
-              <w:rPr>
-                <w:rFonts w:asciiTheme="minorBidi" w:hAnsiTheme="minorBidi" w:cstheme="minorBidi"/>
-                <w:b/>
-                <w:bCs/>
-                <w:w w:val="90"/>
-                <w:sz w:val="20"/>
-                <w:szCs w:val="20"/>
-                <w:u w:val="single"/>
-                <w:lang w:val="en-US"/>
-              </w:rPr>
-            </w:pPr>
-          </w:p>
-        </w:tc>
-      </w:tr>
-      <w:tr>
-        <w:trPr>
-          <w:trHeight w:val="692"/>
-        </w:trPr>
-        <w:tc>
-          <w:tcPr>
-            <w:tcW w:w="715" w:type="dxa"/>
+            </w:pPr>
+            <w:r>
+              <w:rPr>
+                <w:rFonts w:asciiTheme="minorBidi" w:eastAsia="Noto Sans Devanagari" w:hAnsiTheme="minorBidi" w:cs="Mangal"/>
+                <w:sz w:val="22"/>
+                <w:szCs w:val="22"/>
+                <w:cs/>
+                <w:lang w:bidi="hi-IN"/>
+              </w:rPr>
+              <w:t>एकूण</w:t>
+            </w:r>
+          </w:p>
+        </w:tc>
+        <w:tc>
+          <w:tcPr>
+            <w:tcW w:w="1798" w:type="dxa"/>
           </w:tcPr>
           <w:p>
             <w:pPr>
@@ -17779,14 +17962,13 @@
               </w:tabs>
               <w:spacing w:before="271"/>
               <w:ind w:left="450" w:right="-154" w:hanging="360"/>
-              <w:jc w:val="center"/>
               <w:rPr>
                 <w:rFonts w:asciiTheme="minorBidi" w:hAnsiTheme="minorBidi" w:cstheme="minorBidi"/>
                 <w:b/>
                 <w:bCs/>
                 <w:w w:val="90"/>
-                <w:sz w:val="22"/>
-                <w:szCs w:val="22"/>
+                <w:sz w:val="20"/>
+                <w:szCs w:val="20"/>
                 <w:u w:val="single"/>
                 <w:lang w:val="en-US"/>
               </w:rPr>
@@ -17795,7 +17977,7 @@
         </w:tc>
         <w:tc>
           <w:tcPr>
-            <w:tcW w:w="3425" w:type="dxa"/>
+            <w:tcW w:w="1167" w:type="dxa"/>
           </w:tcPr>
           <w:p>
             <w:pPr>
@@ -17805,22 +17987,22 @@
               </w:tabs>
               <w:spacing w:before="271"/>
               <w:ind w:left="450" w:right="-154" w:hanging="360"/>
-            </w:pPr>
-            <w:r>
-              <w:rPr>
-                <w:rFonts w:asciiTheme="minorBidi" w:eastAsia="Noto Sans Devanagari" w:hAnsiTheme="minorBidi" w:cs="Mangal"/>
-                <w:sz w:val="22"/>
-                <w:szCs w:val="22"/>
-                <w:cs/>
-                <w:lang w:bidi="hi-IN"/>
-              </w:rPr>
-              <w:t>एकूण</w:t>
-            </w:r>
-          </w:p>
-        </w:tc>
-        <w:tc>
-          <w:tcPr>
-            <w:tcW w:w="1798" w:type="dxa"/>
+              <w:rPr>
+                <w:rFonts w:asciiTheme="minorBidi" w:hAnsiTheme="minorBidi" w:cstheme="minorBidi"/>
+                <w:b/>
+                <w:bCs/>
+                <w:w w:val="90"/>
+                <w:sz w:val="20"/>
+                <w:szCs w:val="20"/>
+                <w:u w:val="single"/>
+                <w:lang w:val="en-US"/>
+              </w:rPr>
+            </w:pPr>
+          </w:p>
+        </w:tc>
+        <w:tc>
+          <w:tcPr>
+            <w:tcW w:w="1263" w:type="dxa"/>
           </w:tcPr>
           <w:p>
             <w:pPr>
@@ -17830,59 +18012,6 @@
               </w:tabs>
               <w:spacing w:before="271"/>
               <w:ind w:left="450" w:right="-154" w:hanging="360"/>
-              <w:jc w:val="center"/>
-              <w:rPr>
-                <w:rFonts w:asciiTheme="minorBidi" w:hAnsiTheme="minorBidi" w:cstheme="minorBidi"/>
-                <w:b/>
-                <w:bCs/>
-                <w:w w:val="90"/>
-                <w:sz w:val="20"/>
-                <w:szCs w:val="20"/>
-                <w:u w:val="single"/>
-                <w:lang w:val="en-US"/>
-              </w:rPr>
-            </w:pPr>
-          </w:p>
-        </w:tc>
-        <w:tc>
-          <w:tcPr>
-            <w:tcW w:w="1167" w:type="dxa"/>
-          </w:tcPr>
-          <w:p>
-            <w:pPr>
-              <w:pStyle w:val="BodyText"/>
-              <w:tabs>
-                <w:tab w:val="left" w:pos="9369"/>
-              </w:tabs>
-              <w:spacing w:before="271"/>
-              <w:ind w:left="450" w:right="-154" w:hanging="360"/>
-              <w:jc w:val="center"/>
-              <w:rPr>
-                <w:rFonts w:asciiTheme="minorBidi" w:hAnsiTheme="minorBidi" w:cstheme="minorBidi"/>
-                <w:b/>
-                <w:bCs/>
-                <w:w w:val="90"/>
-                <w:sz w:val="20"/>
-                <w:szCs w:val="20"/>
-                <w:u w:val="single"/>
-                <w:lang w:val="en-US"/>
-              </w:rPr>
-            </w:pPr>
-          </w:p>
-        </w:tc>
-        <w:tc>
-          <w:tcPr>
-            <w:tcW w:w="1263" w:type="dxa"/>
-          </w:tcPr>
-          <w:p>
-            <w:pPr>
-              <w:pStyle w:val="BodyText"/>
-              <w:tabs>
-                <w:tab w:val="left" w:pos="9369"/>
-              </w:tabs>
-              <w:spacing w:before="271"/>
-              <w:ind w:left="450" w:right="-154" w:hanging="360"/>
-              <w:jc w:val="center"/>
               <w:rPr>
                 <w:rFonts w:asciiTheme="minorBidi" w:hAnsiTheme="minorBidi" w:cstheme="minorBidi"/>
                 <w:b/>
@@ -18240,8 +18369,6 @@
           <w:lang w:eastAsia="en-IN"/>
         </w:rPr>
       </w:pPr>
-      <w:bookmarkStart w:id="0" w:name="_GoBack"/>
-      <w:bookmarkEnd w:id="0"/>
       <w:r>
         <w:rPr>
           <w:rFonts w:asciiTheme="minorBidi" w:eastAsia="Times New Roman" w:hAnsiTheme="minorBidi" w:cs="Mangal"/>
@@ -26523,8 +26650,11 @@
     </w:p>
     <w:p>
       <w:pPr>
+        <w:tabs>
+          <w:tab w:val="left" w:pos="630"/>
+        </w:tabs>
         <w:spacing w:after="0"/>
-        <w:ind w:left="180" w:right="-154"/>
+        <w:ind w:left="630" w:right="555" w:firstLine="270"/>
       </w:pPr>
       <w:r>
         <w:rPr>
@@ -26910,8 +27040,11 @@
     </w:p>
     <w:p>
       <w:pPr>
+        <w:tabs>
+          <w:tab w:val="left" w:pos="630"/>
+        </w:tabs>
         <w:spacing w:after="0"/>
-        <w:ind w:left="180" w:right="-154"/>
+        <w:ind w:left="1350" w:right="-154" w:hanging="1170"/>
         <w:rPr>
           <w:rFonts w:ascii="Mangal" w:hAnsi="Mangal" w:cs="Mangal"/>
           <w:szCs w:val="22"/>
@@ -27009,8 +27142,11 @@
     </w:p>
     <w:p>
       <w:pPr>
+        <w:tabs>
+          <w:tab w:val="left" w:pos="630"/>
+        </w:tabs>
         <w:spacing w:after="0"/>
-        <w:ind w:left="180" w:right="-154"/>
+        <w:ind w:left="540" w:right="-154" w:firstLine="90"/>
         <w:rPr>
           <w:rFonts w:ascii="Mangal" w:hAnsi="Mangal" w:cs="Mangal"/>
           <w:szCs w:val="22"/>
@@ -27281,7 +27417,7 @@
     <w:p>
       <w:pPr>
         <w:spacing w:after="0"/>
-        <w:ind w:left="180" w:right="-154" w:firstLine="540"/>
+        <w:ind w:left="720" w:right="375" w:firstLine="720"/>
         <w:rPr>
           <w:rFonts w:ascii="Mangal" w:hAnsi="Mangal" w:cs="Mangal"/>
           <w:szCs w:val="22"/>
@@ -27550,7 +27686,7 @@
     <w:p>
       <w:pPr>
         <w:spacing w:after="0"/>
-        <w:ind w:left="180" w:right="-154" w:firstLine="540"/>
+        <w:ind w:left="1170" w:right="-154" w:firstLine="270"/>
         <w:rPr>
           <w:rFonts w:ascii="Mangal" w:hAnsi="Mangal" w:cs="Mangal"/>
           <w:szCs w:val="22"/>
@@ -27635,7 +27771,7 @@
     <w:p>
       <w:pPr>
         <w:spacing w:after="0"/>
-        <w:ind w:left="180" w:right="-154"/>
+        <w:ind w:left="720" w:right="-154"/>
         <w:rPr>
           <w:rFonts w:ascii="Mangal" w:hAnsi="Mangal" w:cs="Mangal"/>
           <w:szCs w:val="22"/>
@@ -27904,7 +28040,7 @@
     <w:p>
       <w:pPr>
         <w:spacing w:after="0"/>
-        <w:ind w:left="180" w:right="-154"/>
+        <w:ind w:left="810" w:right="285" w:firstLine="630"/>
         <w:rPr>
           <w:rFonts w:ascii="Mangal" w:hAnsi="Mangal" w:cs="Mangal"/>
         </w:rPr>
@@ -27919,9 +28055,481 @@
       </w:r>
       <w:r>
         <w:rPr>
-          <w:rFonts w:eastAsia="Arial" w:cs="Arial"/>
-          <w:sz w:val="24"/>
-          <w:szCs w:val="24"/>
+          <w:rFonts w:ascii="Noto Sans Devanagari" w:hAnsi="Noto Sans Devanagari" w:cs="Mangal"/>
+          <w:szCs w:val="22"/>
+          <w:cs/>
+        </w:rPr>
+        <w:t>प्रमाणित</w:t>
+      </w:r>
+      <w:r>
+        <w:rPr>
+          <w:rFonts w:eastAsia="Arial" w:cs="Arial"/>
+          <w:szCs w:val="22"/>
+        </w:rPr>
+        <w:t xml:space="preserve"> </w:t>
+      </w:r>
+      <w:r>
+        <w:rPr>
+          <w:rFonts w:eastAsia="Arial" w:cs="Arial"/>
+          <w:szCs w:val="22"/>
+        </w:rPr>
+        <w:t xml:space="preserve">  </w:t>
+      </w:r>
+      <w:r>
+        <w:rPr>
+          <w:rFonts w:ascii="Noto Sans Devanagari" w:hAnsi="Noto Sans Devanagari" w:cs="Mangal"/>
+          <w:szCs w:val="22"/>
+          <w:cs/>
+        </w:rPr>
+        <w:t>करण्यात</w:t>
+      </w:r>
+      <w:r>
+        <w:rPr>
+          <w:rFonts w:eastAsia="Arial" w:cs="Arial"/>
+          <w:szCs w:val="22"/>
+        </w:rPr>
+        <w:t xml:space="preserve"> </w:t>
+      </w:r>
+      <w:r>
+        <w:rPr>
+          <w:rFonts w:eastAsia="Arial" w:cs="Arial"/>
+          <w:szCs w:val="22"/>
+        </w:rPr>
+        <w:t xml:space="preserve">  </w:t>
+      </w:r>
+      <w:r>
+        <w:rPr>
+          <w:rFonts w:ascii="Noto Sans Devanagari" w:hAnsi="Noto Sans Devanagari" w:cs="Mangal"/>
+          <w:szCs w:val="22"/>
+          <w:cs/>
+        </w:rPr>
+        <w:t>येते</w:t>
+      </w:r>
+      <w:r>
+        <w:rPr>
+          <w:rFonts w:eastAsia="Arial" w:cs="Arial"/>
+          <w:szCs w:val="22"/>
+        </w:rPr>
+        <w:t xml:space="preserve"> </w:t>
+      </w:r>
+      <w:r>
+        <w:rPr>
+          <w:rFonts w:eastAsia="Arial" w:cs="Arial"/>
+          <w:szCs w:val="22"/>
+        </w:rPr>
+        <w:t xml:space="preserve">  </w:t>
+      </w:r>
+      <w:r>
+        <w:rPr>
+          <w:rFonts w:ascii="Noto Sans Devanagari" w:hAnsi="Noto Sans Devanagari" w:cs="Mangal"/>
+          <w:szCs w:val="22"/>
+          <w:cs/>
+        </w:rPr>
+        <w:t>की</w:t>
+      </w:r>
+      <w:r>
+        <w:rPr>
+          <w:rFonts w:eastAsia="Arial" w:cs="Arial"/>
+          <w:szCs w:val="22"/>
+        </w:rPr>
+        <w:t xml:space="preserve">, </w:t>
+      </w:r>
+      <w:r>
+        <w:rPr>
+          <w:rFonts w:eastAsia="Arial" w:cs="Arial"/>
+          <w:szCs w:val="22"/>
+        </w:rPr>
+        <w:t xml:space="preserve">  </w:t>
+      </w:r>
+      <w:r>
+        <w:rPr>
+          <w:rFonts w:ascii="Noto Sans Devanagari" w:hAnsi="Noto Sans Devanagari" w:cs="Mangal"/>
+          <w:szCs w:val="22"/>
+          <w:cs/>
+        </w:rPr>
+        <w:t>सदरचा</w:t>
+      </w:r>
+      <w:r>
+        <w:rPr>
+          <w:rFonts w:ascii="Noto Sans Devanagari" w:hAnsi="Noto Sans Devanagari" w:cs="Mangal"/>
+          <w:szCs w:val="22"/>
+        </w:rPr>
+        <w:t xml:space="preserve">  </w:t>
+      </w:r>
+      <w:r>
+        <w:rPr>
+          <w:rFonts w:eastAsia="Arial" w:cs="Arial"/>
+          <w:szCs w:val="22"/>
+        </w:rPr>
+        <w:t xml:space="preserve"> </w:t>
+      </w:r>
+      <w:r>
+        <w:rPr>
+          <w:rFonts w:ascii="Noto Sans Devanagari" w:hAnsi="Noto Sans Devanagari" w:cs="Mangal"/>
+          <w:szCs w:val="22"/>
+          <w:cs/>
+        </w:rPr>
+        <w:t>वैद्यकीय</w:t>
+      </w:r>
+      <w:r>
+        <w:rPr>
+          <w:rFonts w:eastAsia="Arial" w:cs="Arial"/>
+          <w:szCs w:val="22"/>
+        </w:rPr>
+        <w:t xml:space="preserve"> </w:t>
+      </w:r>
+      <w:r>
+        <w:rPr>
+          <w:rFonts w:eastAsia="Arial" w:cs="Arial"/>
+          <w:szCs w:val="22"/>
+        </w:rPr>
+        <w:t xml:space="preserve">  </w:t>
+      </w:r>
+      <w:r>
+        <w:rPr>
+          <w:rFonts w:ascii="Noto Sans Devanagari" w:hAnsi="Noto Sans Devanagari" w:cs="Mangal"/>
+          <w:szCs w:val="22"/>
+          <w:cs/>
+        </w:rPr>
+        <w:t>प्रस्ताव</w:t>
+      </w:r>
+      <w:r>
+        <w:rPr>
+          <w:rFonts w:ascii="Noto Sans Devanagari" w:hAnsi="Noto Sans Devanagari" w:cs="Mangal"/>
+          <w:szCs w:val="22"/>
+        </w:rPr>
+        <w:t xml:space="preserve">  </w:t>
+      </w:r>
+      <w:r>
+        <w:rPr>
+          <w:rFonts w:eastAsia="Arial" w:cs="Arial"/>
+          <w:szCs w:val="22"/>
+        </w:rPr>
+        <w:t xml:space="preserve"> </w:t>
+      </w:r>
+      <w:r>
+        <w:rPr>
+          <w:rFonts w:ascii="Noto Sans Devanagari" w:hAnsi="Noto Sans Devanagari" w:cs="Mangal"/>
+          <w:szCs w:val="22"/>
+          <w:cs/>
+        </w:rPr>
+        <w:t>मी</w:t>
+      </w:r>
+      <w:r>
+        <w:rPr>
+          <w:rFonts w:eastAsia="Arial" w:cs="Arial"/>
+          <w:szCs w:val="22"/>
+        </w:rPr>
+        <w:t xml:space="preserve"> </w:t>
+      </w:r>
+      <w:r>
+        <w:rPr>
+          <w:rFonts w:eastAsia="Arial" w:cs="Arial"/>
+          <w:szCs w:val="22"/>
+        </w:rPr>
+        <w:t xml:space="preserve">  </w:t>
+      </w:r>
+      <w:r>
+        <w:rPr>
+          <w:rFonts w:eastAsia="Arial" w:cs="Arial"/>
+          <w:b/>
+          <w:bCs/>
+          <w:szCs w:val="22"/>
+        </w:rPr>
+        <w:t>{{</w:t>
+      </w:r>
+      <w:proofErr w:type="spellStart"/>
+      <w:r>
+        <w:rPr>
+          <w:rFonts w:eastAsia="Arial" w:cs="Arial"/>
+          <w:b/>
+          <w:bCs/>
+          <w:szCs w:val="22"/>
+        </w:rPr>
+        <w:t>emp_name_designation</w:t>
+      </w:r>
+      <w:r>
+        <w:rPr>
+          <w:rFonts w:eastAsia="Arial" w:cs="Arial"/>
+          <w:b/>
+          <w:bCs/>
+          <w:szCs w:val="22"/>
+          <w:lang w:eastAsia="en-IN"/>
+        </w:rPr>
+        <w:t>_marathi</w:t>
+      </w:r>
+      <w:proofErr w:type="spellEnd"/>
+      <w:r>
+        <w:rPr>
+          <w:rFonts w:eastAsia="Arial" w:cs="Arial"/>
+          <w:b/>
+          <w:bCs/>
+          <w:szCs w:val="22"/>
+          <w:lang w:eastAsia="en-IN"/>
+        </w:rPr>
+        <w:t>}}</w:t>
+      </w:r>
+      <w:r>
+        <w:rPr>
+          <w:rFonts w:eastAsia="Arial" w:cs="Arial"/>
+          <w:b/>
+          <w:bCs/>
+          <w:szCs w:val="22"/>
+          <w:lang w:eastAsia="en-IN"/>
+        </w:rPr>
+        <w:t xml:space="preserve"> </w:t>
+      </w:r>
+      <w:r>
+        <w:rPr>
+          <w:rFonts w:eastAsia="Arial" w:cs="Arial"/>
+          <w:b/>
+          <w:bCs/>
+          <w:szCs w:val="22"/>
+          <w:lang w:eastAsia="en-IN"/>
+        </w:rPr>
+        <w:t xml:space="preserve"> </w:t>
+      </w:r>
+      <w:r>
+        <w:rPr>
+          <w:rFonts w:eastAsia="Arial" w:cs="Arial"/>
+          <w:b/>
+          <w:bCs/>
+          <w:szCs w:val="22"/>
+          <w:lang w:eastAsia="en-IN"/>
+        </w:rPr>
+        <w:t xml:space="preserve"> </w:t>
+      </w:r>
+      <w:r>
+        <w:rPr>
+          <w:rFonts w:ascii="Noto Sans Devanagari" w:hAnsi="Noto Sans Devanagari" w:cs="Mangal"/>
+          <w:szCs w:val="22"/>
+          <w:cs/>
+        </w:rPr>
+        <w:t>यापूर्वी</w:t>
+      </w:r>
+      <w:r>
+        <w:rPr>
+          <w:rFonts w:eastAsia="Arial" w:cs="Arial"/>
+          <w:szCs w:val="22"/>
+        </w:rPr>
+        <w:t xml:space="preserve"> </w:t>
+      </w:r>
+      <w:r>
+        <w:rPr>
+          <w:rFonts w:ascii="Noto Sans Devanagari" w:hAnsi="Noto Sans Devanagari" w:cs="Mangal"/>
+          <w:szCs w:val="22"/>
+          <w:cs/>
+        </w:rPr>
+        <w:t>इतरत्र</w:t>
+      </w:r>
+      <w:r>
+        <w:rPr>
+          <w:rFonts w:eastAsia="Arial" w:cs="Arial"/>
+          <w:szCs w:val="22"/>
+        </w:rPr>
+        <w:t xml:space="preserve"> </w:t>
+      </w:r>
+      <w:r>
+        <w:rPr>
+          <w:rFonts w:ascii="Noto Sans Devanagari" w:hAnsi="Noto Sans Devanagari" w:cs="Mangal"/>
+          <w:szCs w:val="22"/>
+          <w:cs/>
+        </w:rPr>
+        <w:t>कुठेही</w:t>
+      </w:r>
+      <w:r>
+        <w:rPr>
+          <w:rFonts w:eastAsia="Arial" w:cs="Arial"/>
+          <w:szCs w:val="22"/>
+        </w:rPr>
+        <w:t xml:space="preserve"> </w:t>
+      </w:r>
+      <w:r>
+        <w:rPr>
+          <w:rFonts w:ascii="Noto Sans Devanagari" w:hAnsi="Noto Sans Devanagari" w:cs="Mangal"/>
+          <w:szCs w:val="22"/>
+          <w:cs/>
+        </w:rPr>
+        <w:t>सादर</w:t>
+      </w:r>
+      <w:r>
+        <w:rPr>
+          <w:rFonts w:eastAsia="Arial" w:cs="Arial"/>
+          <w:szCs w:val="22"/>
+        </w:rPr>
+        <w:t xml:space="preserve"> </w:t>
+      </w:r>
+      <w:r>
+        <w:rPr>
+          <w:rFonts w:ascii="Noto Sans Devanagari" w:hAnsi="Noto Sans Devanagari" w:cs="Mangal"/>
+          <w:szCs w:val="22"/>
+          <w:cs/>
+        </w:rPr>
+        <w:t>केलेला</w:t>
+      </w:r>
+      <w:r>
+        <w:rPr>
+          <w:rFonts w:eastAsia="Arial" w:cs="Arial"/>
+          <w:szCs w:val="22"/>
+        </w:rPr>
+        <w:t xml:space="preserve"> </w:t>
+      </w:r>
+      <w:r>
+        <w:rPr>
+          <w:rFonts w:ascii="Noto Sans Devanagari" w:hAnsi="Noto Sans Devanagari" w:cs="Mangal"/>
+          <w:szCs w:val="22"/>
+          <w:cs/>
+        </w:rPr>
+        <w:t>नाही</w:t>
+      </w:r>
+      <w:r>
+        <w:rPr>
+          <w:rFonts w:eastAsia="Arial" w:cs="Arial"/>
+          <w:szCs w:val="22"/>
+        </w:rPr>
+        <w:t xml:space="preserve"> </w:t>
+      </w:r>
+      <w:r>
+        <w:rPr>
+          <w:rFonts w:ascii="Noto Sans Devanagari" w:hAnsi="Noto Sans Devanagari" w:cs="Mangal"/>
+          <w:szCs w:val="22"/>
+          <w:cs/>
+        </w:rPr>
+        <w:t>अथवा</w:t>
+      </w:r>
+      <w:r>
+        <w:rPr>
+          <w:rFonts w:eastAsia="Arial" w:cs="Arial"/>
+          <w:szCs w:val="22"/>
+        </w:rPr>
+        <w:t xml:space="preserve"> </w:t>
+      </w:r>
+      <w:r>
+        <w:rPr>
+          <w:rFonts w:ascii="Noto Sans Devanagari" w:hAnsi="Noto Sans Devanagari" w:cs="Mangal"/>
+          <w:szCs w:val="22"/>
+          <w:cs/>
+        </w:rPr>
+        <w:t>सदर</w:t>
+      </w:r>
+      <w:r>
+        <w:rPr>
+          <w:rFonts w:eastAsia="Arial" w:cs="Arial"/>
+          <w:szCs w:val="22"/>
+        </w:rPr>
+        <w:t xml:space="preserve"> </w:t>
+      </w:r>
+      <w:r>
+        <w:rPr>
+          <w:rFonts w:ascii="Noto Sans Devanagari" w:hAnsi="Noto Sans Devanagari" w:cs="Mangal"/>
+          <w:szCs w:val="22"/>
+          <w:cs/>
+        </w:rPr>
+        <w:t>वैद्यकीय</w:t>
+      </w:r>
+      <w:r>
+        <w:rPr>
+          <w:rFonts w:eastAsia="Arial" w:cs="Arial"/>
+          <w:szCs w:val="22"/>
+        </w:rPr>
+        <w:t xml:space="preserve"> </w:t>
+      </w:r>
+      <w:r>
+        <w:rPr>
+          <w:rFonts w:ascii="Noto Sans Devanagari" w:hAnsi="Noto Sans Devanagari" w:cs="Mangal"/>
+          <w:szCs w:val="22"/>
+          <w:cs/>
+        </w:rPr>
+        <w:t>खर्चाबाबत</w:t>
+      </w:r>
+      <w:r>
+        <w:rPr>
+          <w:rFonts w:eastAsia="Arial" w:cs="Arial"/>
+          <w:szCs w:val="22"/>
+        </w:rPr>
+        <w:t xml:space="preserve"> </w:t>
+      </w:r>
+      <w:r>
+        <w:rPr>
+          <w:rFonts w:ascii="Noto Sans Devanagari" w:hAnsi="Noto Sans Devanagari" w:cs="Mangal"/>
+          <w:szCs w:val="22"/>
+          <w:cs/>
+        </w:rPr>
+        <w:t>अग्रीम</w:t>
+      </w:r>
+      <w:r>
+        <w:rPr>
+          <w:rFonts w:eastAsia="Arial" w:cs="Arial"/>
+          <w:szCs w:val="22"/>
+        </w:rPr>
+        <w:t xml:space="preserve"> </w:t>
+      </w:r>
+      <w:r>
+        <w:rPr>
+          <w:rFonts w:ascii="Noto Sans Devanagari" w:hAnsi="Noto Sans Devanagari" w:cs="Mangal"/>
+          <w:szCs w:val="22"/>
+          <w:cs/>
+        </w:rPr>
+        <w:t>उचल</w:t>
+      </w:r>
+      <w:r>
+        <w:rPr>
+          <w:rFonts w:eastAsia="Arial" w:cs="Arial"/>
+          <w:szCs w:val="22"/>
+        </w:rPr>
+        <w:t xml:space="preserve"> </w:t>
+      </w:r>
+      <w:r>
+        <w:rPr>
+          <w:rFonts w:ascii="Noto Sans Devanagari" w:hAnsi="Noto Sans Devanagari" w:cs="Mangal"/>
+          <w:szCs w:val="22"/>
+          <w:cs/>
+        </w:rPr>
+        <w:t>घेतलेली</w:t>
+      </w:r>
+      <w:r>
+        <w:rPr>
+          <w:rFonts w:eastAsia="Arial" w:cs="Arial"/>
+          <w:szCs w:val="22"/>
+        </w:rPr>
+        <w:t xml:space="preserve"> </w:t>
+      </w:r>
+      <w:r>
+        <w:rPr>
+          <w:rFonts w:ascii="Noto Sans Devanagari" w:hAnsi="Noto Sans Devanagari" w:cs="Mangal"/>
+          <w:szCs w:val="22"/>
+          <w:cs/>
+        </w:rPr>
+        <w:t>नाही</w:t>
+      </w:r>
+      <w:r>
+        <w:rPr>
+          <w:rFonts w:eastAsia="Arial" w:cs="Arial"/>
+          <w:szCs w:val="22"/>
+        </w:rPr>
+        <w:t>.</w:t>
+      </w:r>
+    </w:p>
+    <w:p>
+      <w:pPr>
+        <w:spacing w:after="0"/>
+        <w:ind w:left="1440" w:right="-154" w:hanging="1260"/>
+        <w:rPr>
+          <w:rFonts w:ascii="Mangal" w:hAnsi="Mangal" w:cs="Mangal"/>
+          <w:szCs w:val="22"/>
+        </w:rPr>
+      </w:pPr>
+      <w:r>
+        <w:rPr>
+          <w:rFonts w:eastAsia="Arial" w:cs="Arial"/>
+          <w:szCs w:val="22"/>
+        </w:rPr>
+        <w:t xml:space="preserve"> </w:t>
+      </w:r>
+      <w:r>
+        <w:rPr>
+          <w:rFonts w:eastAsia="Arial" w:cs="Arial"/>
+          <w:szCs w:val="22"/>
         </w:rPr>
         <w:tab/>
       </w:r>
@@ -27931,6 +28539,21 @@
           <w:szCs w:val="22"/>
           <w:cs/>
         </w:rPr>
+        <w:t>करिता</w:t>
+      </w:r>
+      <w:r>
+        <w:rPr>
+          <w:rFonts w:eastAsia="Arial" w:cs="Arial"/>
+          <w:szCs w:val="22"/>
+        </w:rPr>
+        <w:t xml:space="preserve"> </w:t>
+      </w:r>
+      <w:r>
+        <w:rPr>
+          <w:rFonts w:ascii="Noto Sans Devanagari" w:hAnsi="Noto Sans Devanagari" w:cs="Mangal"/>
+          <w:szCs w:val="22"/>
+          <w:cs/>
+        </w:rPr>
         <w:t>प्रमाणित</w:t>
       </w:r>
       <w:r>
@@ -27938,7 +28561,7 @@
           <w:rFonts w:eastAsia="Arial" w:cs="Arial"/>
           <w:szCs w:val="22"/>
         </w:rPr>
-        <w:t xml:space="preserve"> </w:t>
+        <w:t> </w:t>
       </w:r>
       <w:r>
         <w:rPr>
@@ -27953,7 +28576,7 @@
           <w:rFonts w:eastAsia="Arial" w:cs="Arial"/>
           <w:szCs w:val="22"/>
         </w:rPr>
-        <w:t xml:space="preserve"> </w:t>
+        <w:t> </w:t>
       </w:r>
       <w:r>
         <w:rPr>
@@ -27962,368 +28585,6 @@
           <w:cs/>
         </w:rPr>
         <w:t>येते</w:t>
-      </w:r>
-      <w:r>
-        <w:rPr>
-          <w:rFonts w:eastAsia="Arial" w:cs="Arial"/>
-          <w:szCs w:val="22"/>
-        </w:rPr>
-        <w:t xml:space="preserve"> </w:t>
-      </w:r>
-      <w:r>
-        <w:rPr>
-          <w:rFonts w:ascii="Noto Sans Devanagari" w:hAnsi="Noto Sans Devanagari" w:cs="Mangal"/>
-          <w:szCs w:val="22"/>
-          <w:cs/>
-        </w:rPr>
-        <w:t>की</w:t>
-      </w:r>
-      <w:r>
-        <w:rPr>
-          <w:rFonts w:eastAsia="Arial" w:cs="Arial"/>
-          <w:szCs w:val="22"/>
-        </w:rPr>
-        <w:t xml:space="preserve">, </w:t>
-      </w:r>
-      <w:r>
-        <w:rPr>
-          <w:rFonts w:ascii="Noto Sans Devanagari" w:hAnsi="Noto Sans Devanagari" w:cs="Mangal"/>
-          <w:szCs w:val="22"/>
-          <w:cs/>
-        </w:rPr>
-        <w:t>सदरचा</w:t>
-      </w:r>
-      <w:r>
-        <w:rPr>
-          <w:rFonts w:eastAsia="Arial" w:cs="Arial"/>
-          <w:szCs w:val="22"/>
-        </w:rPr>
-        <w:t xml:space="preserve"> </w:t>
-      </w:r>
-      <w:r>
-        <w:rPr>
-          <w:rFonts w:ascii="Noto Sans Devanagari" w:hAnsi="Noto Sans Devanagari" w:cs="Mangal"/>
-          <w:szCs w:val="22"/>
-          <w:cs/>
-        </w:rPr>
-        <w:t>वैद्यकीय</w:t>
-      </w:r>
-      <w:r>
-        <w:rPr>
-          <w:rFonts w:eastAsia="Arial" w:cs="Arial"/>
-          <w:szCs w:val="22"/>
-        </w:rPr>
-        <w:t xml:space="preserve"> </w:t>
-      </w:r>
-      <w:r>
-        <w:rPr>
-          <w:rFonts w:ascii="Noto Sans Devanagari" w:hAnsi="Noto Sans Devanagari" w:cs="Mangal"/>
-          <w:szCs w:val="22"/>
-          <w:cs/>
-        </w:rPr>
-        <w:t>प्रस्ताव</w:t>
-      </w:r>
-      <w:r>
-        <w:rPr>
-          <w:rFonts w:eastAsia="Arial" w:cs="Arial"/>
-          <w:szCs w:val="22"/>
-        </w:rPr>
-        <w:t xml:space="preserve"> </w:t>
-      </w:r>
-      <w:r>
-        <w:rPr>
-          <w:rFonts w:ascii="Noto Sans Devanagari" w:hAnsi="Noto Sans Devanagari" w:cs="Mangal"/>
-          <w:szCs w:val="22"/>
-          <w:cs/>
-        </w:rPr>
-        <w:t>मी</w:t>
-      </w:r>
-      <w:r>
-        <w:rPr>
-          <w:rFonts w:eastAsia="Arial" w:cs="Arial"/>
-          <w:szCs w:val="22"/>
-        </w:rPr>
-        <w:t xml:space="preserve"> </w:t>
-      </w:r>
-      <w:r>
-        <w:rPr>
-          <w:rFonts w:eastAsia="Arial" w:cs="Arial"/>
-          <w:szCs w:val="22"/>
-        </w:rPr>
-        <w:t xml:space="preserve">  </w:t>
-      </w:r>
-      <w:r>
-        <w:rPr>
-          <w:rFonts w:eastAsia="Arial" w:cs="Arial"/>
-          <w:b/>
-          <w:bCs/>
-          <w:szCs w:val="22"/>
-        </w:rPr>
-        <w:t>{{</w:t>
-      </w:r>
-      <w:proofErr w:type="spellStart"/>
-      <w:r>
-        <w:rPr>
-          <w:rFonts w:eastAsia="Arial" w:cs="Arial"/>
-          <w:b/>
-          <w:bCs/>
-          <w:szCs w:val="22"/>
-        </w:rPr>
-        <w:t>emp_name_designation</w:t>
-      </w:r>
-      <w:r>
-        <w:rPr>
-          <w:rFonts w:eastAsia="Arial" w:cs="Arial"/>
-          <w:b/>
-          <w:bCs/>
-          <w:szCs w:val="22"/>
-          <w:lang w:eastAsia="en-IN"/>
-        </w:rPr>
-        <w:t>_marathi</w:t>
-      </w:r>
-      <w:proofErr w:type="spellEnd"/>
-      <w:r>
-        <w:rPr>
-          <w:rFonts w:eastAsia="Arial" w:cs="Arial"/>
-          <w:b/>
-          <w:bCs/>
-          <w:szCs w:val="22"/>
-          <w:lang w:eastAsia="en-IN"/>
-        </w:rPr>
-        <w:t>}}</w:t>
-      </w:r>
-      <w:r>
-        <w:rPr>
-          <w:rFonts w:eastAsia="Arial" w:cs="Arial"/>
-          <w:b/>
-          <w:bCs/>
-          <w:szCs w:val="22"/>
-          <w:lang w:eastAsia="en-IN"/>
-        </w:rPr>
-        <w:t xml:space="preserve"> </w:t>
-      </w:r>
-      <w:r>
-        <w:rPr>
-          <w:rFonts w:eastAsia="Arial" w:cs="Arial"/>
-          <w:b/>
-          <w:bCs/>
-          <w:szCs w:val="22"/>
-          <w:lang w:eastAsia="en-IN"/>
-        </w:rPr>
-        <w:t xml:space="preserve"> </w:t>
-      </w:r>
-      <w:r>
-        <w:rPr>
-          <w:rFonts w:eastAsia="Arial" w:cs="Arial"/>
-          <w:b/>
-          <w:bCs/>
-          <w:szCs w:val="22"/>
-          <w:lang w:eastAsia="en-IN"/>
-        </w:rPr>
-        <w:t xml:space="preserve"> </w:t>
-      </w:r>
-      <w:r>
-        <w:rPr>
-          <w:rFonts w:ascii="Noto Sans Devanagari" w:hAnsi="Noto Sans Devanagari" w:cs="Mangal"/>
-          <w:szCs w:val="22"/>
-          <w:cs/>
-        </w:rPr>
-        <w:t>यापूर्वी</w:t>
-      </w:r>
-      <w:r>
-        <w:rPr>
-          <w:rFonts w:eastAsia="Arial" w:cs="Arial"/>
-          <w:szCs w:val="22"/>
-        </w:rPr>
-        <w:t xml:space="preserve"> </w:t>
-      </w:r>
-      <w:r>
-        <w:rPr>
-          <w:rFonts w:ascii="Noto Sans Devanagari" w:hAnsi="Noto Sans Devanagari" w:cs="Mangal"/>
-          <w:szCs w:val="22"/>
-          <w:cs/>
-        </w:rPr>
-        <w:t>इतरत्र</w:t>
-      </w:r>
-      <w:r>
-        <w:rPr>
-          <w:rFonts w:eastAsia="Arial" w:cs="Arial"/>
-          <w:szCs w:val="22"/>
-        </w:rPr>
-        <w:t xml:space="preserve"> </w:t>
-      </w:r>
-      <w:r>
-        <w:rPr>
-          <w:rFonts w:ascii="Noto Sans Devanagari" w:hAnsi="Noto Sans Devanagari" w:cs="Mangal"/>
-          <w:szCs w:val="22"/>
-          <w:cs/>
-        </w:rPr>
-        <w:t>कुठेही</w:t>
-      </w:r>
-      <w:r>
-        <w:rPr>
-          <w:rFonts w:eastAsia="Arial" w:cs="Arial"/>
-          <w:szCs w:val="22"/>
-        </w:rPr>
-        <w:t xml:space="preserve"> </w:t>
-      </w:r>
-      <w:r>
-        <w:rPr>
-          <w:rFonts w:ascii="Noto Sans Devanagari" w:hAnsi="Noto Sans Devanagari" w:cs="Mangal"/>
-          <w:szCs w:val="22"/>
-          <w:cs/>
-        </w:rPr>
-        <w:t>सादर</w:t>
-      </w:r>
-      <w:r>
-        <w:rPr>
-          <w:rFonts w:eastAsia="Arial" w:cs="Arial"/>
-          <w:szCs w:val="22"/>
-        </w:rPr>
-        <w:t xml:space="preserve"> </w:t>
-      </w:r>
-      <w:r>
-        <w:rPr>
-          <w:rFonts w:ascii="Noto Sans Devanagari" w:hAnsi="Noto Sans Devanagari" w:cs="Mangal"/>
-          <w:szCs w:val="22"/>
-          <w:cs/>
-        </w:rPr>
-        <w:t>केलेला</w:t>
-      </w:r>
-      <w:r>
-        <w:rPr>
-          <w:rFonts w:eastAsia="Arial" w:cs="Arial"/>
-          <w:szCs w:val="22"/>
-        </w:rPr>
-        <w:t xml:space="preserve"> </w:t>
-      </w:r>
-      <w:r>
-        <w:rPr>
-          <w:rFonts w:ascii="Noto Sans Devanagari" w:hAnsi="Noto Sans Devanagari" w:cs="Mangal"/>
-          <w:szCs w:val="22"/>
-          <w:cs/>
-        </w:rPr>
-        <w:t>नाही</w:t>
-      </w:r>
-      <w:r>
-        <w:rPr>
-          <w:rFonts w:eastAsia="Arial" w:cs="Arial"/>
-          <w:szCs w:val="22"/>
-        </w:rPr>
-        <w:t xml:space="preserve"> </w:t>
-      </w:r>
-      <w:r>
-        <w:rPr>
-          <w:rFonts w:ascii="Noto Sans Devanagari" w:hAnsi="Noto Sans Devanagari" w:cs="Mangal"/>
-          <w:szCs w:val="22"/>
-          <w:cs/>
-        </w:rPr>
-        <w:t>अथवा</w:t>
-      </w:r>
-      <w:r>
-        <w:rPr>
-          <w:rFonts w:eastAsia="Arial" w:cs="Arial"/>
-          <w:szCs w:val="22"/>
-        </w:rPr>
-        <w:t xml:space="preserve"> </w:t>
-      </w:r>
-      <w:r>
-        <w:rPr>
-          <w:rFonts w:ascii="Noto Sans Devanagari" w:hAnsi="Noto Sans Devanagari" w:cs="Mangal"/>
-          <w:szCs w:val="22"/>
-          <w:cs/>
-        </w:rPr>
-        <w:t>सदर</w:t>
-      </w:r>
-      <w:r>
-        <w:rPr>
-          <w:rFonts w:eastAsia="Arial" w:cs="Arial"/>
-          <w:szCs w:val="22"/>
-        </w:rPr>
-        <w:t xml:space="preserve"> </w:t>
-      </w:r>
-      <w:r>
-        <w:rPr>
-          <w:rFonts w:ascii="Noto Sans Devanagari" w:hAnsi="Noto Sans Devanagari" w:cs="Mangal"/>
-          <w:szCs w:val="22"/>
-          <w:cs/>
-        </w:rPr>
-        <w:t>वैद्यकीय</w:t>
-      </w:r>
-      <w:r>
-        <w:rPr>
-          <w:rFonts w:eastAsia="Arial" w:cs="Arial"/>
-          <w:szCs w:val="22"/>
-        </w:rPr>
-        <w:t xml:space="preserve"> </w:t>
-      </w:r>
-      <w:r>
-        <w:rPr>
-          <w:rFonts w:ascii="Noto Sans Devanagari" w:hAnsi="Noto Sans Devanagari" w:cs="Mangal"/>
-          <w:szCs w:val="22"/>
-          <w:cs/>
-        </w:rPr>
-        <w:t>खर्चाबाबत</w:t>
-      </w:r>
-      <w:r>
-        <w:rPr>
-          <w:rFonts w:eastAsia="Arial" w:cs="Arial"/>
-          <w:szCs w:val="22"/>
-        </w:rPr>
-        <w:t xml:space="preserve"> </w:t>
-      </w:r>
-      <w:r>
-        <w:rPr>
-          <w:rFonts w:ascii="Noto Sans Devanagari" w:hAnsi="Noto Sans Devanagari" w:cs="Mangal"/>
-          <w:szCs w:val="22"/>
-          <w:cs/>
-        </w:rPr>
-        <w:t>अग्रीम</w:t>
-      </w:r>
-      <w:r>
-        <w:rPr>
-          <w:rFonts w:eastAsia="Arial" w:cs="Arial"/>
-          <w:szCs w:val="22"/>
-        </w:rPr>
-        <w:t xml:space="preserve"> </w:t>
-      </w:r>
-      <w:r>
-        <w:rPr>
-          <w:rFonts w:ascii="Noto Sans Devanagari" w:hAnsi="Noto Sans Devanagari" w:cs="Mangal"/>
-          <w:szCs w:val="22"/>
-          <w:cs/>
-        </w:rPr>
-        <w:t>उचल</w:t>
-      </w:r>
-      <w:r>
-        <w:rPr>
-          <w:rFonts w:eastAsia="Arial" w:cs="Arial"/>
-          <w:szCs w:val="22"/>
-        </w:rPr>
-        <w:t xml:space="preserve"> </w:t>
-      </w:r>
-      <w:r>
-        <w:rPr>
-          <w:rFonts w:ascii="Noto Sans Devanagari" w:hAnsi="Noto Sans Devanagari" w:cs="Mangal"/>
-          <w:szCs w:val="22"/>
-          <w:cs/>
-        </w:rPr>
-        <w:t>घेतलेली</w:t>
-      </w:r>
-      <w:r>
-        <w:rPr>
-          <w:rFonts w:eastAsia="Arial" w:cs="Arial"/>
-          <w:szCs w:val="22"/>
-        </w:rPr>
-        <w:t xml:space="preserve"> </w:t>
-      </w:r>
-      <w:r>
-        <w:rPr>
-          <w:rFonts w:ascii="Noto Sans Devanagari" w:hAnsi="Noto Sans Devanagari" w:cs="Mangal"/>
-          <w:szCs w:val="22"/>
-          <w:cs/>
-        </w:rPr>
-        <w:t>नाही</w:t>
       </w:r>
       <w:r>
         <w:rPr>
@@ -28342,95 +28603,11 @@
           <w:szCs w:val="22"/>
         </w:rPr>
       </w:pPr>
-      <w:r>
-        <w:rPr>
-          <w:rFonts w:eastAsia="Arial" w:cs="Arial"/>
-          <w:szCs w:val="22"/>
-        </w:rPr>
-        <w:t xml:space="preserve"> </w:t>
-      </w:r>
-      <w:r>
-        <w:rPr>
-          <w:rFonts w:eastAsia="Arial" w:cs="Arial"/>
-          <w:szCs w:val="22"/>
-        </w:rPr>
-        <w:tab/>
-      </w:r>
-      <w:r>
-        <w:rPr>
-          <w:rFonts w:ascii="Noto Sans Devanagari" w:hAnsi="Noto Sans Devanagari" w:cs="Mangal"/>
-          <w:szCs w:val="22"/>
-          <w:cs/>
-        </w:rPr>
-        <w:t>करिता</w:t>
-      </w:r>
-      <w:r>
-        <w:rPr>
-          <w:rFonts w:eastAsia="Arial" w:cs="Arial"/>
-          <w:szCs w:val="22"/>
-        </w:rPr>
-        <w:t xml:space="preserve"> </w:t>
-      </w:r>
-      <w:r>
-        <w:rPr>
-          <w:rFonts w:ascii="Noto Sans Devanagari" w:hAnsi="Noto Sans Devanagari" w:cs="Mangal"/>
-          <w:szCs w:val="22"/>
-          <w:cs/>
-        </w:rPr>
-        <w:t>प्रमाणित</w:t>
-      </w:r>
-      <w:r>
-        <w:rPr>
-          <w:rFonts w:eastAsia="Arial" w:cs="Arial"/>
-          <w:szCs w:val="22"/>
-        </w:rPr>
-        <w:t> </w:t>
-      </w:r>
-      <w:r>
-        <w:rPr>
-          <w:rFonts w:ascii="Noto Sans Devanagari" w:hAnsi="Noto Sans Devanagari" w:cs="Mangal"/>
-          <w:szCs w:val="22"/>
-          <w:cs/>
-        </w:rPr>
-        <w:t>करण्यात</w:t>
-      </w:r>
-      <w:r>
-        <w:rPr>
-          <w:rFonts w:eastAsia="Arial" w:cs="Arial"/>
-          <w:szCs w:val="22"/>
-        </w:rPr>
-        <w:t> </w:t>
-      </w:r>
-      <w:r>
-        <w:rPr>
-          <w:rFonts w:ascii="Noto Sans Devanagari" w:hAnsi="Noto Sans Devanagari" w:cs="Mangal"/>
-          <w:szCs w:val="22"/>
-          <w:cs/>
-        </w:rPr>
-        <w:t>येते</w:t>
-      </w:r>
-      <w:r>
-        <w:rPr>
-          <w:rFonts w:eastAsia="Arial" w:cs="Arial"/>
-          <w:szCs w:val="22"/>
-        </w:rPr>
-        <w:t>.</w:t>
-      </w:r>
     </w:p>
     <w:p>
       <w:pPr>
         <w:spacing w:after="0"/>
-        <w:ind w:left="180" w:right="-154"/>
-        <w:rPr>
-          <w:rFonts w:ascii="Mangal" w:hAnsi="Mangal" w:cs="Mangal"/>
-          <w:szCs w:val="22"/>
-        </w:rPr>
-      </w:pPr>
-    </w:p>
-    <w:p>
-      <w:pPr>
-        <w:spacing w:after="0"/>
-        <w:ind w:left="180" w:right="-154"/>
+        <w:ind w:left="900" w:right="-154"/>
         <w:rPr>
           <w:rFonts w:ascii="Mangal" w:hAnsi="Mangal" w:cs="Mangal"/>
           <w:szCs w:val="22"/>
@@ -31310,6 +31487,8 @@
         </w:rPr>
         <w:br w:type="page"/>
       </w:r>
+      <w:bookmarkStart w:id="0" w:name="_GoBack"/>
+      <w:bookmarkEnd w:id="0"/>
     </w:p>
     <w:p>
       <w:pPr>
@@ -36214,7 +36393,7 @@
 </file>
 
 <file path=customXml/itemProps1.xml><?xml version="1.0" encoding="utf-8"?>
-<ds:datastoreItem xmlns:ds="http://schemas.openxmlformats.org/officeDocument/2006/customXml" ds:itemID="{68570772-A725-45C7-9622-D95C7589CAA8}">
+<ds:datastoreItem xmlns:ds="http://schemas.openxmlformats.org/officeDocument/2006/customXml" ds:itemID="{597B50E9-9B21-4244-A13D-EE31CC8490D8}">
   <ds:schemaRefs>
     <ds:schemaRef ds:uri="http://schemas.openxmlformats.org/officeDocument/2006/bibliography"/>
   </ds:schemaRefs>

</xml_diff>